<commit_message>
feat: WEEE/Battery signup, Amazon SP-API compliance, template tags, bug fixes
- Add About page with company info, qualifications, partner docs
- Add Contact page with form + phone/email in footer
- Enhance Landing page with trust signals + CTA
- Redesign WEEE/Battery pages to match Packaging structure
- Inject docxtemplater tags into all 4 WEEE/Battery contract templates
- Fix Alipay total_amount bug (was dividing CNY by rate twice)
- Fix profile PUT route (was locked behind adminMiddleware)
- Fix login frontend validation to allow phone numbers
- Fix contact form to actually POST data
- Add public /api/contact endpoint
- Add 404 catch-all route
- Add WEEE Return qualification PDFs to public dir
- Add DB migration for phone uniqueness
- Code review cleanup

Co-Authored-By: Claude <noreply@anthropic.com>
</commit_message>
<xml_diff>
--- a/projects/中国主体合同/非德国主体_WEEE&电池法合同模板_Bevollmächtigungsvertrag_Kunde mit Sitz außerhalb von Deutschland_WEEE & Batterien.docx
+++ b/projects/中国主体合同/非德国主体_WEEE&电池法合同模板_Bevollmächtigungsvertrag_Kunde mit Sitz außerhalb von Deutschland_WEEE & Batterien.docx
@@ -137,7 +137,7 @@
             </w14:solidFill>
           </w14:textFill>
         </w:rPr>
-        <w:t>Nr.: XXX_XX_XXXXX_001</w:t>
+        <w:t>Nr.: {contract_number}</w:t>
       </w:r>
     </w:p>
     <w:p>
@@ -172,7 +172,7 @@
             </w14:solidFill>
           </w14:textFill>
         </w:rPr>
-        <w:t>XXX_XX_XXXXX_001</w:t>
+        <w:t>{contract_number}</w:t>
       </w:r>
     </w:p>
     <w:p>
@@ -227,7 +227,14 @@
           <w:highlight w:val="yellow"/>
           <w:lang w:val="en-US" w:eastAsia="zh-CN"/>
         </w:rPr>
-        <w:t>Shenzhensenyanghongkeji Co., Ltd.</w:t>
+        <w:t>{company_name_en}</w:t>
+      </w:r>
+      <w:r>
+        <w:rPr>
+          <w:rFonts w:hint="eastAsia" w:ascii="宋体" w:hAnsi="宋体" w:eastAsia="宋体" w:cs="宋体"/>
+          <w:lang w:val="en-US" w:eastAsia="zh-CN"/>
+        </w:rPr>
+        <w:t xml:space="preserve"> / {company_name}</w:t>
       </w:r>
       <w:r>
         <w:rPr>
@@ -9406,30 +9413,22 @@
           <w:szCs w:val="21"/>
           <w:lang w:val="en-US" w:eastAsia="zh-CN"/>
         </w:rPr>
-        <w:t>shenzhen</w:t>
-      </w:r>
-      <w:r>
-        <w:t>, den</w:t>
-      </w:r>
+        <w:t>{sign_date}                                {wr_sign_date}</w:t>
+      </w:r>
+      <w:r/>
       <w:r>
         <w:rPr>
           <w:rFonts w:hint="eastAsia" w:eastAsia="宋体"/>
           <w:lang w:val="en-US" w:eastAsia="zh-CN"/>
         </w:rPr>
-        <w:t xml:space="preserve"> 深圳/日期</w:t>
-      </w:r>
-      <w:r>
-        <w:tab/>
-      </w:r>
-      <w:r>
-        <w:t xml:space="preserve">Berlin, den </w:t>
-      </w:r>
+      </w:r>
+      <w:r/>
+      <w:r/>
       <w:r>
         <w:rPr>
           <w:rFonts w:hint="eastAsia" w:eastAsia="宋体"/>
           <w:lang w:val="en-US" w:eastAsia="zh-CN"/>
         </w:rPr>
-        <w:t>柏林，日期</w:t>
       </w:r>
     </w:p>
     <w:p>
@@ -9566,7 +9565,7 @@
     </w:p>
     <w:p>
       <w:r>
-        <w:t>___________________________________________</w:t>
+        <w:t>{company_name_en}</w:t>
       </w:r>
     </w:p>
     <w:p>
@@ -9604,7 +9603,7 @@
           <w:sz w:val="18"/>
           <w:szCs w:val="18"/>
         </w:rPr>
-        <w:t>____________________________________________________</w:t>
+        <w:t>{company_address}</w:t>
       </w:r>
     </w:p>
     <w:p>
@@ -9642,7 +9641,7 @@
           <w:sz w:val="18"/>
           <w:szCs w:val="18"/>
         </w:rPr>
-        <w:t>____________________________________________________</w:t>
+        <w:t>{registered_address_en}</w:t>
       </w:r>
     </w:p>
     <w:p>
@@ -9680,7 +9679,7 @@
           <w:sz w:val="18"/>
           <w:szCs w:val="18"/>
         </w:rPr>
-        <w:t>____________________________________________________</w:t>
+        <w:t>{contact_phone}</w:t>
       </w:r>
     </w:p>
     <w:p>
@@ -9718,7 +9717,7 @@
           <w:sz w:val="18"/>
           <w:szCs w:val="18"/>
         </w:rPr>
-        <w:t>____________________________________________________</w:t>
+        <w:t>{contact_email}</w:t>
       </w:r>
     </w:p>
     <w:p>
@@ -9756,7 +9755,7 @@
           <w:sz w:val="18"/>
           <w:szCs w:val="18"/>
         </w:rPr>
-        <w:t>____________________________________________________</w:t>
+        <w:t>{legal_representative_en}</w:t>
       </w:r>
     </w:p>
     <w:p>
@@ -9794,7 +9793,7 @@
           <w:sz w:val="18"/>
           <w:szCs w:val="18"/>
         </w:rPr>
-        <w:t>____________________________________________________</w:t>
+        <w:t>{uscc}</w:t>
       </w:r>
     </w:p>
     <w:p>
@@ -10126,7 +10125,7 @@
     </w:p>
     <w:p>
       <w:r>
-        <w:t>___________________________________________</w:t>
+        <w:t>{company_name}</w:t>
       </w:r>
     </w:p>
     <w:p>
@@ -10185,7 +10184,7 @@
           <w:sz w:val="18"/>
           <w:szCs w:val="18"/>
         </w:rPr>
-        <w:t>____________________________________________________</w:t>
+        <w:t>{company_address}</w:t>
       </w:r>
     </w:p>
     <w:p>
@@ -10227,7 +10226,7 @@
           <w:sz w:val="18"/>
           <w:szCs w:val="18"/>
         </w:rPr>
-        <w:t>____________________________________________________</w:t>
+        <w:t>{registered_address_en}</w:t>
       </w:r>
     </w:p>
     <w:p>
@@ -10265,7 +10264,7 @@
           <w:sz w:val="18"/>
           <w:szCs w:val="18"/>
         </w:rPr>
-        <w:t>____________________________________________________</w:t>
+        <w:t>{contact_phone}</w:t>
       </w:r>
     </w:p>
     <w:p>
@@ -10307,7 +10306,7 @@
           <w:sz w:val="18"/>
           <w:szCs w:val="18"/>
         </w:rPr>
-        <w:t>____________________________________________________</w:t>
+        <w:t>{contact_email}</w:t>
       </w:r>
     </w:p>
     <w:p>
@@ -10349,7 +10348,7 @@
           <w:sz w:val="18"/>
           <w:szCs w:val="18"/>
         </w:rPr>
-        <w:t>____________________________________________________</w:t>
+        <w:t>{legal_representative}</w:t>
       </w:r>
     </w:p>
     <w:p>
@@ -10391,7 +10390,7 @@
           <w:sz w:val="18"/>
           <w:szCs w:val="18"/>
         </w:rPr>
-        <w:t>____________________________________________________</w:t>
+        <w:t>{uscc}</w:t>
       </w:r>
     </w:p>
     <w:p>
@@ -10426,18 +10425,15 @@
         <w:jc w:val="left"/>
       </w:pPr>
       <w:r>
-        <w:t>委托位于柏林 12055 拉恩街 31 号、在柏林夏洛滕堡地方法院注册编号为 HRB 177217、增值税号为 DE815645465 的电子废弃物回收有限公司（由董事Sebastian Schormann</w:t>
+        <w:t>{wr_sign_city}</w:t>
       </w:r>
       <w:r>
         <w:rPr>
           <w:rFonts w:hint="eastAsia" w:eastAsia="宋体"/>
           <w:lang w:val="en-US" w:eastAsia="zh-CN"/>
         </w:rPr>
-        <w:t>和</w:t>
-      </w:r>
-      <w:r>
-        <w:t>Christian Winkler代表）</w:t>
-      </w:r>
+      </w:r>
+      <w:r/>
     </w:p>
     <w:p>
       <w:pPr>
@@ -10816,7 +10812,7 @@
           <w:rFonts w:hint="eastAsia" w:eastAsia="宋体"/>
           <w:lang w:val="en-US" w:eastAsia="zh-CN"/>
         </w:rPr>
-        <w:t>柏林</w:t>
+        <w:t>{wr_sign_city}</w:t>
       </w:r>
     </w:p>
     <w:p>
@@ -14193,7 +14189,7 @@
           <w:sz w:val="20"/>
           <w:szCs w:val="20"/>
         </w:rPr>
-        <w:t xml:space="preserve">________________________________ </w:t>
+        <w:t>{company_name_en}</w:t>
       </w:r>
     </w:p>
     <w:p>
@@ -14209,7 +14205,7 @@
           <w:sz w:val="20"/>
           <w:szCs w:val="20"/>
         </w:rPr>
-        <w:t xml:space="preserve">________________________________ </w:t>
+        <w:t>{company_address}</w:t>
       </w:r>
     </w:p>
     <w:p>
@@ -14225,7 +14221,7 @@
           <w:sz w:val="20"/>
           <w:szCs w:val="20"/>
         </w:rPr>
-        <w:t xml:space="preserve">________________________________ </w:t>
+        <w:t>{registered_address_en}</w:t>
       </w:r>
     </w:p>
     <w:p>
@@ -14745,7 +14741,7 @@
           <w:sz w:val="20"/>
           <w:szCs w:val="20"/>
         </w:rPr>
-        <w:t xml:space="preserve">__________________________________ </w:t>
+        <w:t>{contact_phone}</w:t>
       </w:r>
     </w:p>
     <w:p>
@@ -14822,7 +14818,7 @@
           <w:sz w:val="20"/>
           <w:szCs w:val="20"/>
         </w:rPr>
-        <w:t xml:space="preserve">__________________________________ </w:t>
+        <w:t>{company_name}</w:t>
       </w:r>
     </w:p>
     <w:p>
@@ -14986,7 +14982,7 @@
           <w:szCs w:val="20"/>
           <w:lang w:val="de-DE" w:eastAsia="en-US" w:bidi="ar-SA"/>
         </w:rPr>
-        <w:t xml:space="preserve">________________________________ </w:t>
+        <w:t>{company_address}</w:t>
       </w:r>
     </w:p>
     <w:p>
@@ -15011,7 +15007,7 @@
           <w:szCs w:val="20"/>
           <w:lang w:val="de-DE" w:eastAsia="en-US" w:bidi="ar-SA"/>
         </w:rPr>
-        <w:t xml:space="preserve">________________________________ </w:t>
+        <w:t>{registered_address_en}</w:t>
       </w:r>
     </w:p>
     <w:p>
@@ -15036,7 +15032,7 @@
           <w:szCs w:val="20"/>
           <w:lang w:val="de-DE" w:eastAsia="en-US" w:bidi="ar-SA"/>
         </w:rPr>
-        <w:t xml:space="preserve">________________________________ </w:t>
+        <w:t>{contact_phone}</w:t>
       </w:r>
     </w:p>
     <w:p>
@@ -18648,7 +18644,7 @@
           <w:rFonts w:hint="eastAsia" w:eastAsia="宋体"/>
           <w:lang w:val="en-US" w:eastAsia="zh-CN"/>
         </w:rPr>
-        <w:t>柏林</w:t>
+        <w:t>{wr_sign_city}</w:t>
       </w:r>
     </w:p>
     <w:p>
@@ -18838,7 +18834,7 @@
           <w:sz w:val="20"/>
           <w:szCs w:val="20"/>
         </w:rPr>
-        <w:t>______________________</w:t>
+        <w:t>{company_name_en}</w:t>
       </w:r>
     </w:p>
     <w:p>
@@ -18854,7 +18850,7 @@
           <w:sz w:val="20"/>
           <w:szCs w:val="20"/>
         </w:rPr>
-        <w:t>______________________</w:t>
+        <w:t>{company_address}</w:t>
       </w:r>
     </w:p>
     <w:p>
@@ -18870,7 +18866,7 @@
           <w:sz w:val="20"/>
           <w:szCs w:val="20"/>
         </w:rPr>
-        <w:t>______________________</w:t>
+        <w:t>{registered_address_en}</w:t>
       </w:r>
     </w:p>
     <w:p>
@@ -18886,7 +18882,7 @@
           <w:sz w:val="20"/>
           <w:szCs w:val="20"/>
         </w:rPr>
-        <w:t xml:space="preserve">______________________  </w:t>
+        <w:t>{contact_phone}</w:t>
       </w:r>
     </w:p>
     <w:p>

</xml_diff>